<commit_message>
Update LAB6 report and add README
</commit_message>
<xml_diff>
--- a/LAB6/LAB6.docx
+++ b/LAB6/LAB6.docx
@@ -4,7 +4,21 @@
   <w:body>
     <w:p/>
     <w:p/>
-    <w:p/>
+    <w:p>
+      <w:hyperlink r:id="rId5" w:history="1">
+        <w:r>
+          <w:rPr>
+            <w:rStyle w:val="Hyperlink"/>
+          </w:rPr>
+          <w:t>https://youtu.be/GGsjokC6w7I</w:t>
+        </w:r>
+      </w:hyperlink>
+      <w:r>
+        <w:t xml:space="preserve"> </w:t>
+      </w:r>
+      <w:bookmarkStart w:id="0" w:name="_GoBack"/>
+      <w:bookmarkEnd w:id="0"/>
+    </w:p>
     <w:p>
       <w:r>
         <w:t xml:space="preserve">Chuẩn bị </w:t>
@@ -15,58 +29,14 @@
     </w:p>
     <w:p>
       <w:r>
+        <w:rPr>
+          <w:noProof/>
+        </w:rPr>
         <w:drawing>
           <wp:inline distT="0" distB="0" distL="0" distR="0" wp14:anchorId="09ECC26A" wp14:editId="37AF6A60">
             <wp:extent cx="4582164" cy="3010320"/>
             <wp:effectExtent l="0" t="0" r="8890" b="0"/>
             <wp:docPr id="1" name="Picture 1"/>
-            <wp:cNvGraphicFramePr>
-              <a:graphicFrameLocks xmlns:a="http://schemas.openxmlformats.org/drawingml/2006/main" noChangeAspect="1"/>
-            </wp:cNvGraphicFramePr>
-            <a:graphic xmlns:a="http://schemas.openxmlformats.org/drawingml/2006/main">
-              <a:graphicData uri="http://schemas.openxmlformats.org/drawingml/2006/picture">
-                <pic:pic xmlns:pic="http://schemas.openxmlformats.org/drawingml/2006/picture">
-                  <pic:nvPicPr>
-                    <pic:cNvPr id="1" name=""/>
-                    <pic:cNvPicPr/>
-                  </pic:nvPicPr>
-                  <pic:blipFill>
-                    <a:blip r:embed="rId5"/>
-                    <a:stretch>
-                      <a:fillRect/>
-                    </a:stretch>
-                  </pic:blipFill>
-                  <pic:spPr>
-                    <a:xfrm>
-                      <a:off x="0" y="0"/>
-                      <a:ext cx="4582164" cy="3010320"/>
-                    </a:xfrm>
-                    <a:prstGeom prst="rect">
-                      <a:avLst/>
-                    </a:prstGeom>
-                  </pic:spPr>
-                </pic:pic>
-              </a:graphicData>
-            </a:graphic>
-          </wp:inline>
-        </w:drawing>
-      </w:r>
-    </w:p>
-    <w:p>
-      <w:pPr>
-        <w:tabs>
-          <w:tab w:val="left" w:pos="1005"/>
-        </w:tabs>
-      </w:pPr>
-      <w:r>
-        <w:tab/>
-      </w:r>
-      <w:r>
-        <w:drawing>
-          <wp:inline distT="0" distB="0" distL="0" distR="0" wp14:anchorId="2DC06E01" wp14:editId="3044E752">
-            <wp:extent cx="5943600" cy="3319145"/>
-            <wp:effectExtent l="0" t="0" r="0" b="0"/>
-            <wp:docPr id="2" name="Picture 2"/>
             <wp:cNvGraphicFramePr>
               <a:graphicFrameLocks xmlns:a="http://schemas.openxmlformats.org/drawingml/2006/main" noChangeAspect="1"/>
             </wp:cNvGraphicFramePr>
@@ -86,6 +56,56 @@
                   <pic:spPr>
                     <a:xfrm>
                       <a:off x="0" y="0"/>
+                      <a:ext cx="4582164" cy="3010320"/>
+                    </a:xfrm>
+                    <a:prstGeom prst="rect">
+                      <a:avLst/>
+                    </a:prstGeom>
+                  </pic:spPr>
+                </pic:pic>
+              </a:graphicData>
+            </a:graphic>
+          </wp:inline>
+        </w:drawing>
+      </w:r>
+    </w:p>
+    <w:p>
+      <w:pPr>
+        <w:tabs>
+          <w:tab w:val="left" w:pos="1005"/>
+        </w:tabs>
+      </w:pPr>
+      <w:r>
+        <w:tab/>
+      </w:r>
+      <w:r>
+        <w:rPr>
+          <w:noProof/>
+        </w:rPr>
+        <w:drawing>
+          <wp:inline distT="0" distB="0" distL="0" distR="0" wp14:anchorId="2DC06E01" wp14:editId="3044E752">
+            <wp:extent cx="5943600" cy="3319145"/>
+            <wp:effectExtent l="0" t="0" r="0" b="0"/>
+            <wp:docPr id="2" name="Picture 2"/>
+            <wp:cNvGraphicFramePr>
+              <a:graphicFrameLocks xmlns:a="http://schemas.openxmlformats.org/drawingml/2006/main" noChangeAspect="1"/>
+            </wp:cNvGraphicFramePr>
+            <a:graphic xmlns:a="http://schemas.openxmlformats.org/drawingml/2006/main">
+              <a:graphicData uri="http://schemas.openxmlformats.org/drawingml/2006/picture">
+                <pic:pic xmlns:pic="http://schemas.openxmlformats.org/drawingml/2006/picture">
+                  <pic:nvPicPr>
+                    <pic:cNvPr id="1" name=""/>
+                    <pic:cNvPicPr/>
+                  </pic:nvPicPr>
+                  <pic:blipFill>
+                    <a:blip r:embed="rId7"/>
+                    <a:stretch>
+                      <a:fillRect/>
+                    </a:stretch>
+                  </pic:blipFill>
+                  <pic:spPr>
+                    <a:xfrm>
+                      <a:off x="0" y="0"/>
                       <a:ext cx="5943600" cy="3319145"/>
                     </a:xfrm>
                     <a:prstGeom prst="rect">
@@ -105,9 +125,894 @@
       </w:r>
     </w:p>
     <w:p>
-      <w:bookmarkStart w:id="0" w:name="_GoBack"/>
-      <w:bookmarkEnd w:id="0"/>
-    </w:p>
+      <w:r>
+        <w:lastRenderedPageBreak/>
+        <w:t>DC01 – IP 10.6.0.10 và ping pfSense</w:t>
+      </w:r>
+    </w:p>
+    <w:p>
+      <w:r>
+        <w:rPr>
+          <w:noProof/>
+        </w:rPr>
+        <w:drawing>
+          <wp:inline distT="0" distB="0" distL="0" distR="0">
+            <wp:extent cx="5868219" cy="1886213"/>
+            <wp:effectExtent l="0" t="0" r="0" b="0"/>
+            <wp:docPr id="4" name="Picture 4"/>
+            <wp:cNvGraphicFramePr>
+              <a:graphicFrameLocks xmlns:a="http://schemas.openxmlformats.org/drawingml/2006/main" noChangeAspect="1"/>
+            </wp:cNvGraphicFramePr>
+            <a:graphic xmlns:a="http://schemas.openxmlformats.org/drawingml/2006/main">
+              <a:graphicData uri="http://schemas.openxmlformats.org/drawingml/2006/picture">
+                <pic:pic xmlns:pic="http://schemas.openxmlformats.org/drawingml/2006/picture">
+                  <pic:nvPicPr>
+                    <pic:cNvPr id="4" name="964db36a-46ac-4aad-b572-74f05df254fe.png"/>
+                    <pic:cNvPicPr/>
+                  </pic:nvPicPr>
+                  <pic:blipFill>
+                    <a:blip r:embed="rId8">
+                      <a:extLst>
+                        <a:ext uri="{28A0092B-C50C-407E-A947-70E740481C1C}">
+                          <a14:useLocalDpi xmlns:a14="http://schemas.microsoft.com/office/drawing/2010/main" val="0"/>
+                        </a:ext>
+                      </a:extLst>
+                    </a:blip>
+                    <a:stretch>
+                      <a:fillRect/>
+                    </a:stretch>
+                  </pic:blipFill>
+                  <pic:spPr>
+                    <a:xfrm>
+                      <a:off x="0" y="0"/>
+                      <a:ext cx="5868219" cy="1886213"/>
+                    </a:xfrm>
+                    <a:prstGeom prst="rect">
+                      <a:avLst/>
+                    </a:prstGeom>
+                  </pic:spPr>
+                </pic:pic>
+              </a:graphicData>
+            </a:graphic>
+          </wp:inline>
+        </w:drawing>
+      </w:r>
+      <w:r>
+        <w:rPr>
+          <w:noProof/>
+        </w:rPr>
+        <mc:AlternateContent>
+          <mc:Choice Requires="wps">
+            <w:drawing>
+              <wp:inline distT="0" distB="0" distL="0" distR="0">
+                <wp:extent cx="304800" cy="304800"/>
+                <wp:effectExtent l="0" t="0" r="0" b="0"/>
+                <wp:docPr id="3" name="Rectangle 3" descr="Tệp đính kèm của người dùng"/>
+                <wp:cNvGraphicFramePr>
+                  <a:graphicFrameLocks xmlns:a="http://schemas.openxmlformats.org/drawingml/2006/main" noChangeAspect="1"/>
+                </wp:cNvGraphicFramePr>
+                <a:graphic xmlns:a="http://schemas.openxmlformats.org/drawingml/2006/main">
+                  <a:graphicData uri="http://schemas.microsoft.com/office/word/2010/wordprocessingShape">
+                    <wps:wsp>
+                      <wps:cNvSpPr>
+                        <a:spLocks noChangeAspect="1" noChangeArrowheads="1"/>
+                      </wps:cNvSpPr>
+                      <wps:spPr bwMode="auto">
+                        <a:xfrm>
+                          <a:off x="0" y="0"/>
+                          <a:ext cx="304800" cy="304800"/>
+                        </a:xfrm>
+                        <a:prstGeom prst="rect">
+                          <a:avLst/>
+                        </a:prstGeom>
+                        <a:noFill/>
+                        <a:ln>
+                          <a:noFill/>
+                        </a:ln>
+                        <a:extLst>
+                          <a:ext uri="{909E8E84-426E-40DD-AFC4-6F175D3DCCD1}">
+                            <a14:hiddenFill xmlns:a14="http://schemas.microsoft.com/office/drawing/2010/main">
+                              <a:solidFill>
+                                <a:srgbClr val="FFFFFF"/>
+                              </a:solidFill>
+                            </a14:hiddenFill>
+                          </a:ext>
+                          <a:ext uri="{91240B29-F687-4F45-9708-019B960494DF}">
+                            <a14:hiddenLine xmlns:a14="http://schemas.microsoft.com/office/drawing/2010/main" w="9525">
+                              <a:solidFill>
+                                <a:srgbClr val="000000"/>
+                              </a:solidFill>
+                              <a:miter lim="800000"/>
+                              <a:headEnd/>
+                              <a:tailEnd/>
+                            </a14:hiddenLine>
+                          </a:ext>
+                        </a:extLst>
+                      </wps:spPr>
+                      <wps:bodyPr rot="0" vert="horz" wrap="square" lIns="91440" tIns="45720" rIns="91440" bIns="45720" anchor="t" anchorCtr="0" upright="1">
+                        <a:noAutofit/>
+                      </wps:bodyPr>
+                    </wps:wsp>
+                  </a:graphicData>
+                </a:graphic>
+              </wp:inline>
+            </w:drawing>
+          </mc:Choice>
+          <mc:Fallback>
+            <w:pict>
+              <v:rect w14:anchorId="34CC3478" id="Rectangle 3" o:spid="_x0000_s1026" alt="Tệp đính kèm của người dùng" style="width:24pt;height:24pt;visibility:visible;mso-wrap-style:square;mso-left-percent:-10001;mso-top-percent:-10001;mso-position-horizontal:absolute;mso-position-horizontal-relative:char;mso-position-vertical:absolute;mso-position-vertical-relative:line;mso-left-percent:-10001;mso-top-percent:-10001;v-text-anchor:top" o:gfxdata="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" filled="f" stroked="f">
+                <o:lock v:ext="edit" aspectratio="t"/>
+                <w10:anchorlock/>
+              </v:rect>
+            </w:pict>
+          </mc:Fallback>
+        </mc:AlternateContent>
+      </w:r>
+    </w:p>
+    <w:p>
+      <w:r>
+        <w:t>LAB6_DC01 đã kết nối Internet và phân giải DNS được</w:t>
+      </w:r>
+    </w:p>
+    <w:p>
+      <w:r>
+        <w:rPr>
+          <w:noProof/>
+        </w:rPr>
+        <w:drawing>
+          <wp:inline distT="0" distB="0" distL="0" distR="0">
+            <wp:extent cx="5943600" cy="2509520"/>
+            <wp:effectExtent l="0" t="0" r="0" b="5080"/>
+            <wp:docPr id="5" name="Picture 5"/>
+            <wp:cNvGraphicFramePr>
+              <a:graphicFrameLocks xmlns:a="http://schemas.openxmlformats.org/drawingml/2006/main" noChangeAspect="1"/>
+            </wp:cNvGraphicFramePr>
+            <a:graphic xmlns:a="http://schemas.openxmlformats.org/drawingml/2006/main">
+              <a:graphicData uri="http://schemas.openxmlformats.org/drawingml/2006/picture">
+                <pic:pic xmlns:pic="http://schemas.openxmlformats.org/drawingml/2006/picture">
+                  <pic:nvPicPr>
+                    <pic:cNvPr id="5" name="Ảnh ChatGPT 09_49_49 17 thg 10, 2026.png"/>
+                    <pic:cNvPicPr/>
+                  </pic:nvPicPr>
+                  <pic:blipFill>
+                    <a:blip r:embed="rId9">
+                      <a:extLst>
+                        <a:ext uri="{28A0092B-C50C-407E-A947-70E740481C1C}">
+                          <a14:useLocalDpi xmlns:a14="http://schemas.microsoft.com/office/drawing/2010/main" val="0"/>
+                        </a:ext>
+                      </a:extLst>
+                    </a:blip>
+                    <a:stretch>
+                      <a:fillRect/>
+                    </a:stretch>
+                  </pic:blipFill>
+                  <pic:spPr>
+                    <a:xfrm>
+                      <a:off x="0" y="0"/>
+                      <a:ext cx="5943600" cy="2509520"/>
+                    </a:xfrm>
+                    <a:prstGeom prst="rect">
+                      <a:avLst/>
+                    </a:prstGeom>
+                  </pic:spPr>
+                </pic:pic>
+              </a:graphicData>
+            </a:graphic>
+          </wp:inline>
+        </w:drawing>
+      </w:r>
+    </w:p>
+    <w:p>
+      <w:r>
+        <w:t>Cài Samba AD</w:t>
+      </w:r>
+    </w:p>
+    <w:p>
+      <w:r>
+        <w:rPr>
+          <w:noProof/>
+        </w:rPr>
+        <w:lastRenderedPageBreak/>
+        <w:drawing>
+          <wp:inline distT="0" distB="0" distL="0" distR="0">
+            <wp:extent cx="5943600" cy="3319780"/>
+            <wp:effectExtent l="0" t="0" r="0" b="0"/>
+            <wp:docPr id="6" name="Picture 6"/>
+            <wp:cNvGraphicFramePr>
+              <a:graphicFrameLocks xmlns:a="http://schemas.openxmlformats.org/drawingml/2006/main" noChangeAspect="1"/>
+            </wp:cNvGraphicFramePr>
+            <a:graphic xmlns:a="http://schemas.openxmlformats.org/drawingml/2006/main">
+              <a:graphicData uri="http://schemas.openxmlformats.org/drawingml/2006/picture">
+                <pic:pic xmlns:pic="http://schemas.openxmlformats.org/drawingml/2006/picture">
+                  <pic:nvPicPr>
+                    <pic:cNvPr id="6" name="5dd5b052-a0e4-471e-aa74-773c97319ed0.png"/>
+                    <pic:cNvPicPr/>
+                  </pic:nvPicPr>
+                  <pic:blipFill>
+                    <a:blip r:embed="rId10">
+                      <a:extLst>
+                        <a:ext uri="{28A0092B-C50C-407E-A947-70E740481C1C}">
+                          <a14:useLocalDpi xmlns:a14="http://schemas.microsoft.com/office/drawing/2010/main" val="0"/>
+                        </a:ext>
+                      </a:extLst>
+                    </a:blip>
+                    <a:stretch>
+                      <a:fillRect/>
+                    </a:stretch>
+                  </pic:blipFill>
+                  <pic:spPr>
+                    <a:xfrm>
+                      <a:off x="0" y="0"/>
+                      <a:ext cx="5943600" cy="3319780"/>
+                    </a:xfrm>
+                    <a:prstGeom prst="rect">
+                      <a:avLst/>
+                    </a:prstGeom>
+                  </pic:spPr>
+                </pic:pic>
+              </a:graphicData>
+            </a:graphic>
+          </wp:inline>
+        </w:drawing>
+      </w:r>
+    </w:p>
+    <w:p>
+      <w:pPr>
+        <w:rPr>
+          <w:rStyle w:val="HTMLCode"/>
+          <w:rFonts w:eastAsiaTheme="minorHAnsi"/>
+        </w:rPr>
+      </w:pPr>
+      <w:r>
+        <w:t xml:space="preserve">đổi hostname thành công sang </w:t>
+      </w:r>
+      <w:r>
+        <w:rPr>
+          <w:rStyle w:val="HTMLCode"/>
+          <w:rFonts w:eastAsiaTheme="minorHAnsi"/>
+        </w:rPr>
+        <w:t>dc01</w:t>
+      </w:r>
+    </w:p>
+    <w:p>
+      <w:r>
+        <w:rPr>
+          <w:noProof/>
+        </w:rPr>
+        <w:drawing>
+          <wp:inline distT="0" distB="0" distL="0" distR="0">
+            <wp:extent cx="5943600" cy="2590165"/>
+            <wp:effectExtent l="0" t="0" r="0" b="635"/>
+            <wp:docPr id="9" name="Picture 9"/>
+            <wp:cNvGraphicFramePr>
+              <a:graphicFrameLocks xmlns:a="http://schemas.openxmlformats.org/drawingml/2006/main" noChangeAspect="1"/>
+            </wp:cNvGraphicFramePr>
+            <a:graphic xmlns:a="http://schemas.openxmlformats.org/drawingml/2006/main">
+              <a:graphicData uri="http://schemas.openxmlformats.org/drawingml/2006/picture">
+                <pic:pic xmlns:pic="http://schemas.openxmlformats.org/drawingml/2006/picture">
+                  <pic:nvPicPr>
+                    <pic:cNvPr id="9" name="Ảnh ChatGPT 09_51_56 17 thg 10, 2026.png"/>
+                    <pic:cNvPicPr/>
+                  </pic:nvPicPr>
+                  <pic:blipFill>
+                    <a:blip r:embed="rId11">
+                      <a:extLst>
+                        <a:ext uri="{28A0092B-C50C-407E-A947-70E740481C1C}">
+                          <a14:useLocalDpi xmlns:a14="http://schemas.microsoft.com/office/drawing/2010/main" val="0"/>
+                        </a:ext>
+                      </a:extLst>
+                    </a:blip>
+                    <a:stretch>
+                      <a:fillRect/>
+                    </a:stretch>
+                  </pic:blipFill>
+                  <pic:spPr>
+                    <a:xfrm>
+                      <a:off x="0" y="0"/>
+                      <a:ext cx="5943600" cy="2590165"/>
+                    </a:xfrm>
+                    <a:prstGeom prst="rect">
+                      <a:avLst/>
+                    </a:prstGeom>
+                  </pic:spPr>
+                </pic:pic>
+              </a:graphicData>
+            </a:graphic>
+          </wp:inline>
+        </w:drawing>
+      </w:r>
+    </w:p>
+    <w:p>
+      <w:r>
+        <w:t>DC01: IP, Internet, hostname</w:t>
+      </w:r>
+    </w:p>
+    <w:p>
+      <w:r>
+        <w:rPr>
+          <w:noProof/>
+        </w:rPr>
+        <w:drawing>
+          <wp:inline distT="0" distB="0" distL="0" distR="0">
+            <wp:extent cx="4525006" cy="1171739"/>
+            <wp:effectExtent l="0" t="0" r="0" b="9525"/>
+            <wp:docPr id="10" name="Picture 10"/>
+            <wp:cNvGraphicFramePr>
+              <a:graphicFrameLocks xmlns:a="http://schemas.openxmlformats.org/drawingml/2006/main" noChangeAspect="1"/>
+            </wp:cNvGraphicFramePr>
+            <a:graphic xmlns:a="http://schemas.openxmlformats.org/drawingml/2006/main">
+              <a:graphicData uri="http://schemas.openxmlformats.org/drawingml/2006/picture">
+                <pic:pic xmlns:pic="http://schemas.openxmlformats.org/drawingml/2006/picture">
+                  <pic:nvPicPr>
+                    <pic:cNvPr id="10" name="Ảnh ChatGPT 09_53_28 17 thg 10, 2026.png"/>
+                    <pic:cNvPicPr/>
+                  </pic:nvPicPr>
+                  <pic:blipFill>
+                    <a:blip r:embed="rId12">
+                      <a:extLst>
+                        <a:ext uri="{28A0092B-C50C-407E-A947-70E740481C1C}">
+                          <a14:useLocalDpi xmlns:a14="http://schemas.microsoft.com/office/drawing/2010/main" val="0"/>
+                        </a:ext>
+                      </a:extLst>
+                    </a:blip>
+                    <a:stretch>
+                      <a:fillRect/>
+                    </a:stretch>
+                  </pic:blipFill>
+                  <pic:spPr>
+                    <a:xfrm>
+                      <a:off x="0" y="0"/>
+                      <a:ext cx="4525006" cy="1171739"/>
+                    </a:xfrm>
+                    <a:prstGeom prst="rect">
+                      <a:avLst/>
+                    </a:prstGeom>
+                  </pic:spPr>
+                </pic:pic>
+              </a:graphicData>
+            </a:graphic>
+          </wp:inline>
+        </w:drawing>
+      </w:r>
+    </w:p>
+    <w:p>
+      <w:r>
+        <w:t>dừng và vô hiệu hóa các dịch vụ Samba thông thường.</w:t>
+      </w:r>
+    </w:p>
+    <w:p>
+      <w:r>
+        <w:rPr>
+          <w:noProof/>
+        </w:rPr>
+        <w:lastRenderedPageBreak/>
+        <w:drawing>
+          <wp:inline distT="0" distB="0" distL="0" distR="0">
+            <wp:extent cx="5943600" cy="2098040"/>
+            <wp:effectExtent l="0" t="0" r="0" b="0"/>
+            <wp:docPr id="11" name="Picture 11"/>
+            <wp:cNvGraphicFramePr>
+              <a:graphicFrameLocks xmlns:a="http://schemas.openxmlformats.org/drawingml/2006/main" noChangeAspect="1"/>
+            </wp:cNvGraphicFramePr>
+            <a:graphic xmlns:a="http://schemas.openxmlformats.org/drawingml/2006/main">
+              <a:graphicData uri="http://schemas.openxmlformats.org/drawingml/2006/picture">
+                <pic:pic xmlns:pic="http://schemas.openxmlformats.org/drawingml/2006/picture">
+                  <pic:nvPicPr>
+                    <pic:cNvPr id="11" name="Ảnh ChatGPT 09_54_34 17 thg 10, 2026.png"/>
+                    <pic:cNvPicPr/>
+                  </pic:nvPicPr>
+                  <pic:blipFill>
+                    <a:blip r:embed="rId13">
+                      <a:extLst>
+                        <a:ext uri="{28A0092B-C50C-407E-A947-70E740481C1C}">
+                          <a14:useLocalDpi xmlns:a14="http://schemas.microsoft.com/office/drawing/2010/main" val="0"/>
+                        </a:ext>
+                      </a:extLst>
+                    </a:blip>
+                    <a:stretch>
+                      <a:fillRect/>
+                    </a:stretch>
+                  </pic:blipFill>
+                  <pic:spPr>
+                    <a:xfrm>
+                      <a:off x="0" y="0"/>
+                      <a:ext cx="5943600" cy="2098040"/>
+                    </a:xfrm>
+                    <a:prstGeom prst="rect">
+                      <a:avLst/>
+                    </a:prstGeom>
+                  </pic:spPr>
+                </pic:pic>
+              </a:graphicData>
+            </a:graphic>
+          </wp:inline>
+        </w:drawing>
+      </w:r>
+    </w:p>
+    <w:p>
+      <w:r>
+        <w:t>Samba đã tạo được domain LAB6.TEST</w:t>
+      </w:r>
+    </w:p>
+    <w:p>
+      <w:r>
+        <w:rPr>
+          <w:noProof/>
+        </w:rPr>
+        <w:drawing>
+          <wp:inline distT="0" distB="0" distL="0" distR="0">
+            <wp:extent cx="5943600" cy="1941195"/>
+            <wp:effectExtent l="0" t="0" r="0" b="1905"/>
+            <wp:docPr id="12" name="Picture 12"/>
+            <wp:cNvGraphicFramePr>
+              <a:graphicFrameLocks xmlns:a="http://schemas.openxmlformats.org/drawingml/2006/main" noChangeAspect="1"/>
+            </wp:cNvGraphicFramePr>
+            <a:graphic xmlns:a="http://schemas.openxmlformats.org/drawingml/2006/main">
+              <a:graphicData uri="http://schemas.openxmlformats.org/drawingml/2006/picture">
+                <pic:pic xmlns:pic="http://schemas.openxmlformats.org/drawingml/2006/picture">
+                  <pic:nvPicPr>
+                    <pic:cNvPr id="12" name="Ảnh ChatGPT 09_55_39 17 thg 10, 2026.png"/>
+                    <pic:cNvPicPr/>
+                  </pic:nvPicPr>
+                  <pic:blipFill>
+                    <a:blip r:embed="rId14">
+                      <a:extLst>
+                        <a:ext uri="{28A0092B-C50C-407E-A947-70E740481C1C}">
+                          <a14:useLocalDpi xmlns:a14="http://schemas.microsoft.com/office/drawing/2010/main" val="0"/>
+                        </a:ext>
+                      </a:extLst>
+                    </a:blip>
+                    <a:stretch>
+                      <a:fillRect/>
+                    </a:stretch>
+                  </pic:blipFill>
+                  <pic:spPr>
+                    <a:xfrm>
+                      <a:off x="0" y="0"/>
+                      <a:ext cx="5943600" cy="1941195"/>
+                    </a:xfrm>
+                    <a:prstGeom prst="rect">
+                      <a:avLst/>
+                    </a:prstGeom>
+                  </pic:spPr>
+                </pic:pic>
+              </a:graphicData>
+            </a:graphic>
+          </wp:inline>
+        </w:drawing>
+      </w:r>
+    </w:p>
+    <w:p>
+      <w:pPr>
+        <w:pStyle w:val="Heading2"/>
+      </w:pPr>
+      <w:r>
+        <w:t>Tạo tài khoản sv_a và sv_b</w:t>
+      </w:r>
+    </w:p>
+    <w:p>
+      <w:r>
+        <w:rPr>
+          <w:noProof/>
+        </w:rPr>
+        <w:drawing>
+          <wp:inline distT="0" distB="0" distL="0" distR="0">
+            <wp:extent cx="5943600" cy="3044190"/>
+            <wp:effectExtent l="0" t="0" r="0" b="3810"/>
+            <wp:docPr id="13" name="Picture 13"/>
+            <wp:cNvGraphicFramePr>
+              <a:graphicFrameLocks xmlns:a="http://schemas.openxmlformats.org/drawingml/2006/main" noChangeAspect="1"/>
+            </wp:cNvGraphicFramePr>
+            <a:graphic xmlns:a="http://schemas.openxmlformats.org/drawingml/2006/main">
+              <a:graphicData uri="http://schemas.openxmlformats.org/drawingml/2006/picture">
+                <pic:pic xmlns:pic="http://schemas.openxmlformats.org/drawingml/2006/picture">
+                  <pic:nvPicPr>
+                    <pic:cNvPr id="13" name="Ảnh ChatGPT 09_56_48 17 thg 10, 2026.png"/>
+                    <pic:cNvPicPr/>
+                  </pic:nvPicPr>
+                  <pic:blipFill>
+                    <a:blip r:embed="rId15">
+                      <a:extLst>
+                        <a:ext uri="{28A0092B-C50C-407E-A947-70E740481C1C}">
+                          <a14:useLocalDpi xmlns:a14="http://schemas.microsoft.com/office/drawing/2010/main" val="0"/>
+                        </a:ext>
+                      </a:extLst>
+                    </a:blip>
+                    <a:stretch>
+                      <a:fillRect/>
+                    </a:stretch>
+                  </pic:blipFill>
+                  <pic:spPr>
+                    <a:xfrm>
+                      <a:off x="0" y="0"/>
+                      <a:ext cx="5943600" cy="3044190"/>
+                    </a:xfrm>
+                    <a:prstGeom prst="rect">
+                      <a:avLst/>
+                    </a:prstGeom>
+                  </pic:spPr>
+                </pic:pic>
+              </a:graphicData>
+            </a:graphic>
+          </wp:inline>
+        </w:drawing>
+      </w:r>
+    </w:p>
+    <w:p>
+      <w:r>
+        <w:t>tài khoản LDAP Bind cho LAB 6.</w:t>
+      </w:r>
+    </w:p>
+    <w:p>
+      <w:r>
+        <w:rPr>
+          <w:noProof/>
+        </w:rPr>
+        <w:lastRenderedPageBreak/>
+        <w:drawing>
+          <wp:inline distT="0" distB="0" distL="0" distR="0">
+            <wp:extent cx="5943600" cy="5543550"/>
+            <wp:effectExtent l="0" t="0" r="0" b="0"/>
+            <wp:docPr id="14" name="Picture 14"/>
+            <wp:cNvGraphicFramePr>
+              <a:graphicFrameLocks xmlns:a="http://schemas.openxmlformats.org/drawingml/2006/main" noChangeAspect="1"/>
+            </wp:cNvGraphicFramePr>
+            <a:graphic xmlns:a="http://schemas.openxmlformats.org/drawingml/2006/main">
+              <a:graphicData uri="http://schemas.openxmlformats.org/drawingml/2006/picture">
+                <pic:pic xmlns:pic="http://schemas.openxmlformats.org/drawingml/2006/picture">
+                  <pic:nvPicPr>
+                    <pic:cNvPr id="14" name="Ảnh ChatGPT 09_57_52 17 thg 10, 2026.png"/>
+                    <pic:cNvPicPr/>
+                  </pic:nvPicPr>
+                  <pic:blipFill>
+                    <a:blip r:embed="rId16">
+                      <a:extLst>
+                        <a:ext uri="{28A0092B-C50C-407E-A947-70E740481C1C}">
+                          <a14:useLocalDpi xmlns:a14="http://schemas.microsoft.com/office/drawing/2010/main" val="0"/>
+                        </a:ext>
+                      </a:extLst>
+                    </a:blip>
+                    <a:stretch>
+                      <a:fillRect/>
+                    </a:stretch>
+                  </pic:blipFill>
+                  <pic:spPr>
+                    <a:xfrm>
+                      <a:off x="0" y="0"/>
+                      <a:ext cx="5943600" cy="5543550"/>
+                    </a:xfrm>
+                    <a:prstGeom prst="rect">
+                      <a:avLst/>
+                    </a:prstGeom>
+                  </pic:spPr>
+                </pic:pic>
+              </a:graphicData>
+            </a:graphic>
+          </wp:inline>
+        </w:drawing>
+      </w:r>
+    </w:p>
+    <w:p>
+      <w:r>
+        <w:t>cấu hình DNS Samba cho DC01.</w:t>
+      </w:r>
+    </w:p>
+    <w:p>
+      <w:r>
+        <w:rPr>
+          <w:noProof/>
+        </w:rPr>
+        <w:lastRenderedPageBreak/>
+        <w:drawing>
+          <wp:inline distT="0" distB="0" distL="0" distR="0">
+            <wp:extent cx="5943600" cy="2454275"/>
+            <wp:effectExtent l="0" t="0" r="0" b="3175"/>
+            <wp:docPr id="15" name="Picture 15"/>
+            <wp:cNvGraphicFramePr>
+              <a:graphicFrameLocks xmlns:a="http://schemas.openxmlformats.org/drawingml/2006/main" noChangeAspect="1"/>
+            </wp:cNvGraphicFramePr>
+            <a:graphic xmlns:a="http://schemas.openxmlformats.org/drawingml/2006/main">
+              <a:graphicData uri="http://schemas.openxmlformats.org/drawingml/2006/picture">
+                <pic:pic xmlns:pic="http://schemas.openxmlformats.org/drawingml/2006/picture">
+                  <pic:nvPicPr>
+                    <pic:cNvPr id="15" name="Ảnh ChatGPT 09_58_48 17 thg 10, 2026.png"/>
+                    <pic:cNvPicPr/>
+                  </pic:nvPicPr>
+                  <pic:blipFill>
+                    <a:blip r:embed="rId17">
+                      <a:extLst>
+                        <a:ext uri="{28A0092B-C50C-407E-A947-70E740481C1C}">
+                          <a14:useLocalDpi xmlns:a14="http://schemas.microsoft.com/office/drawing/2010/main" val="0"/>
+                        </a:ext>
+                      </a:extLst>
+                    </a:blip>
+                    <a:stretch>
+                      <a:fillRect/>
+                    </a:stretch>
+                  </pic:blipFill>
+                  <pic:spPr>
+                    <a:xfrm>
+                      <a:off x="0" y="0"/>
+                      <a:ext cx="5943600" cy="2454275"/>
+                    </a:xfrm>
+                    <a:prstGeom prst="rect">
+                      <a:avLst/>
+                    </a:prstGeom>
+                  </pic:spPr>
+                </pic:pic>
+              </a:graphicData>
+            </a:graphic>
+          </wp:inline>
+        </w:drawing>
+      </w:r>
+    </w:p>
+    <w:p>
+      <w:r>
+        <w:t>cấu hình Kerberos của Samba</w:t>
+      </w:r>
+    </w:p>
+    <w:p>
+      <w:r>
+        <w:rPr>
+          <w:noProof/>
+        </w:rPr>
+        <w:drawing>
+          <wp:inline distT="0" distB="0" distL="0" distR="0">
+            <wp:extent cx="5943600" cy="3732530"/>
+            <wp:effectExtent l="0" t="0" r="0" b="1270"/>
+            <wp:docPr id="16" name="Picture 16"/>
+            <wp:cNvGraphicFramePr>
+              <a:graphicFrameLocks xmlns:a="http://schemas.openxmlformats.org/drawingml/2006/main" noChangeAspect="1"/>
+            </wp:cNvGraphicFramePr>
+            <a:graphic xmlns:a="http://schemas.openxmlformats.org/drawingml/2006/main">
+              <a:graphicData uri="http://schemas.openxmlformats.org/drawingml/2006/picture">
+                <pic:pic xmlns:pic="http://schemas.openxmlformats.org/drawingml/2006/picture">
+                  <pic:nvPicPr>
+                    <pic:cNvPr id="16" name="Ảnh ChatGPT 09_59_30 17 thg 10, 2026.png"/>
+                    <pic:cNvPicPr/>
+                  </pic:nvPicPr>
+                  <pic:blipFill>
+                    <a:blip r:embed="rId18">
+                      <a:extLst>
+                        <a:ext uri="{28A0092B-C50C-407E-A947-70E740481C1C}">
+                          <a14:useLocalDpi xmlns:a14="http://schemas.microsoft.com/office/drawing/2010/main" val="0"/>
+                        </a:ext>
+                      </a:extLst>
+                    </a:blip>
+                    <a:stretch>
+                      <a:fillRect/>
+                    </a:stretch>
+                  </pic:blipFill>
+                  <pic:spPr>
+                    <a:xfrm>
+                      <a:off x="0" y="0"/>
+                      <a:ext cx="5943600" cy="3732530"/>
+                    </a:xfrm>
+                    <a:prstGeom prst="rect">
+                      <a:avLst/>
+                    </a:prstGeom>
+                  </pic:spPr>
+                </pic:pic>
+              </a:graphicData>
+            </a:graphic>
+          </wp:inline>
+        </w:drawing>
+      </w:r>
+    </w:p>
+    <w:p>
+      <w:r>
+        <w:t>Samba đã tạo chứng chỉ TLS cho DC01.</w:t>
+      </w:r>
+    </w:p>
+    <w:p>
+      <w:r>
+        <w:rPr>
+          <w:noProof/>
+        </w:rPr>
+        <w:drawing>
+          <wp:inline distT="0" distB="0" distL="0" distR="0">
+            <wp:extent cx="5943600" cy="1031240"/>
+            <wp:effectExtent l="0" t="0" r="0" b="0"/>
+            <wp:docPr id="17" name="Picture 17"/>
+            <wp:cNvGraphicFramePr>
+              <a:graphicFrameLocks xmlns:a="http://schemas.openxmlformats.org/drawingml/2006/main" noChangeAspect="1"/>
+            </wp:cNvGraphicFramePr>
+            <a:graphic xmlns:a="http://schemas.openxmlformats.org/drawingml/2006/main">
+              <a:graphicData uri="http://schemas.openxmlformats.org/drawingml/2006/picture">
+                <pic:pic xmlns:pic="http://schemas.openxmlformats.org/drawingml/2006/picture">
+                  <pic:nvPicPr>
+                    <pic:cNvPr id="17" name="Ảnh ChatGPT 10_00_41 17 thg 10, 2026.png"/>
+                    <pic:cNvPicPr/>
+                  </pic:nvPicPr>
+                  <pic:blipFill>
+                    <a:blip r:embed="rId19">
+                      <a:extLst>
+                        <a:ext uri="{28A0092B-C50C-407E-A947-70E740481C1C}">
+                          <a14:useLocalDpi xmlns:a14="http://schemas.microsoft.com/office/drawing/2010/main" val="0"/>
+                        </a:ext>
+                      </a:extLst>
+                    </a:blip>
+                    <a:stretch>
+                      <a:fillRect/>
+                    </a:stretch>
+                  </pic:blipFill>
+                  <pic:spPr>
+                    <a:xfrm>
+                      <a:off x="0" y="0"/>
+                      <a:ext cx="5943600" cy="1031240"/>
+                    </a:xfrm>
+                    <a:prstGeom prst="rect">
+                      <a:avLst/>
+                    </a:prstGeom>
+                  </pic:spPr>
+                </pic:pic>
+              </a:graphicData>
+            </a:graphic>
+          </wp:inline>
+        </w:drawing>
+      </w:r>
+    </w:p>
+    <w:p>
+      <w:r>
+        <w:lastRenderedPageBreak/>
+        <w:t>Chứng chỉ CA của Samba trên LAB6_DC01 đã được kiểm tra và hợp lệ</w:t>
+      </w:r>
+    </w:p>
+    <w:p>
+      <w:r>
+        <w:rPr>
+          <w:noProof/>
+        </w:rPr>
+        <w:drawing>
+          <wp:inline distT="0" distB="0" distL="0" distR="0">
+            <wp:extent cx="5943600" cy="1480820"/>
+            <wp:effectExtent l="0" t="0" r="0" b="5080"/>
+            <wp:docPr id="18" name="Picture 18"/>
+            <wp:cNvGraphicFramePr>
+              <a:graphicFrameLocks xmlns:a="http://schemas.openxmlformats.org/drawingml/2006/main" noChangeAspect="1"/>
+            </wp:cNvGraphicFramePr>
+            <a:graphic xmlns:a="http://schemas.openxmlformats.org/drawingml/2006/main">
+              <a:graphicData uri="http://schemas.openxmlformats.org/drawingml/2006/picture">
+                <pic:pic xmlns:pic="http://schemas.openxmlformats.org/drawingml/2006/picture">
+                  <pic:nvPicPr>
+                    <pic:cNvPr id="18" name="Ảnh ChatGPT 10_01_31 17 thg 10, 2026.png"/>
+                    <pic:cNvPicPr/>
+                  </pic:nvPicPr>
+                  <pic:blipFill>
+                    <a:blip r:embed="rId20">
+                      <a:extLst>
+                        <a:ext uri="{28A0092B-C50C-407E-A947-70E740481C1C}">
+                          <a14:useLocalDpi xmlns:a14="http://schemas.microsoft.com/office/drawing/2010/main" val="0"/>
+                        </a:ext>
+                      </a:extLst>
+                    </a:blip>
+                    <a:stretch>
+                      <a:fillRect/>
+                    </a:stretch>
+                  </pic:blipFill>
+                  <pic:spPr>
+                    <a:xfrm>
+                      <a:off x="0" y="0"/>
+                      <a:ext cx="5943600" cy="1480820"/>
+                    </a:xfrm>
+                    <a:prstGeom prst="rect">
+                      <a:avLst/>
+                    </a:prstGeom>
+                  </pic:spPr>
+                </pic:pic>
+              </a:graphicData>
+            </a:graphic>
+          </wp:inline>
+        </w:drawing>
+      </w:r>
+    </w:p>
+    <w:p>
+      <w:r>
+        <w:t>pfSense đã kết nối được với DNS Samba trên DC01.</w:t>
+      </w:r>
+    </w:p>
+    <w:p>
+      <w:r>
+        <w:rPr>
+          <w:noProof/>
+        </w:rPr>
+        <w:drawing>
+          <wp:inline distT="0" distB="0" distL="0" distR="0">
+            <wp:extent cx="5943600" cy="2422525"/>
+            <wp:effectExtent l="0" t="0" r="0" b="0"/>
+            <wp:docPr id="19" name="Picture 19"/>
+            <wp:cNvGraphicFramePr>
+              <a:graphicFrameLocks xmlns:a="http://schemas.openxmlformats.org/drawingml/2006/main" noChangeAspect="1"/>
+            </wp:cNvGraphicFramePr>
+            <a:graphic xmlns:a="http://schemas.openxmlformats.org/drawingml/2006/main">
+              <a:graphicData uri="http://schemas.openxmlformats.org/drawingml/2006/picture">
+                <pic:pic xmlns:pic="http://schemas.openxmlformats.org/drawingml/2006/picture">
+                  <pic:nvPicPr>
+                    <pic:cNvPr id="19" name="Ảnh ChatGPT 10_02_30 17 thg 10, 2026.png"/>
+                    <pic:cNvPicPr/>
+                  </pic:nvPicPr>
+                  <pic:blipFill>
+                    <a:blip r:embed="rId21">
+                      <a:extLst>
+                        <a:ext uri="{28A0092B-C50C-407E-A947-70E740481C1C}">
+                          <a14:useLocalDpi xmlns:a14="http://schemas.microsoft.com/office/drawing/2010/main" val="0"/>
+                        </a:ext>
+                      </a:extLst>
+                    </a:blip>
+                    <a:stretch>
+                      <a:fillRect/>
+                    </a:stretch>
+                  </pic:blipFill>
+                  <pic:spPr>
+                    <a:xfrm>
+                      <a:off x="0" y="0"/>
+                      <a:ext cx="5943600" cy="2422525"/>
+                    </a:xfrm>
+                    <a:prstGeom prst="rect">
+                      <a:avLst/>
+                    </a:prstGeom>
+                  </pic:spPr>
+                </pic:pic>
+              </a:graphicData>
+            </a:graphic>
+          </wp:inline>
+        </w:drawing>
+      </w:r>
+    </w:p>
+    <w:p>
+      <w:r>
+        <w:t>cấu hình chính xác Firewall Rule cho mạng MGMT (OPT1)</w:t>
+      </w:r>
+    </w:p>
+    <w:p>
+      <w:r>
+        <w:rPr>
+          <w:noProof/>
+        </w:rPr>
+        <w:drawing>
+          <wp:inline distT="0" distB="0" distL="0" distR="0">
+            <wp:extent cx="5943600" cy="3159760"/>
+            <wp:effectExtent l="0" t="0" r="0" b="2540"/>
+            <wp:docPr id="20" name="Picture 20"/>
+            <wp:cNvGraphicFramePr>
+              <a:graphicFrameLocks xmlns:a="http://schemas.openxmlformats.org/drawingml/2006/main" noChangeAspect="1"/>
+            </wp:cNvGraphicFramePr>
+            <a:graphic xmlns:a="http://schemas.openxmlformats.org/drawingml/2006/main">
+              <a:graphicData uri="http://schemas.openxmlformats.org/drawingml/2006/picture">
+                <pic:pic xmlns:pic="http://schemas.openxmlformats.org/drawingml/2006/picture">
+                  <pic:nvPicPr>
+                    <pic:cNvPr id="20" name="Ảnh ChatGPT 10_04_22 17 thg 10, 2026.png"/>
+                    <pic:cNvPicPr/>
+                  </pic:nvPicPr>
+                  <pic:blipFill>
+                    <a:blip r:embed="rId22">
+                      <a:extLst>
+                        <a:ext uri="{28A0092B-C50C-407E-A947-70E740481C1C}">
+                          <a14:useLocalDpi xmlns:a14="http://schemas.microsoft.com/office/drawing/2010/main" val="0"/>
+                        </a:ext>
+                      </a:extLst>
+                    </a:blip>
+                    <a:stretch>
+                      <a:fillRect/>
+                    </a:stretch>
+                  </pic:blipFill>
+                  <pic:spPr>
+                    <a:xfrm>
+                      <a:off x="0" y="0"/>
+                      <a:ext cx="5943600" cy="3159760"/>
+                    </a:xfrm>
+                    <a:prstGeom prst="rect">
+                      <a:avLst/>
+                    </a:prstGeom>
+                  </pic:spPr>
+                </pic:pic>
+              </a:graphicData>
+            </a:graphic>
+          </wp:inline>
+        </w:drawing>
+      </w:r>
+    </w:p>
+    <w:p/>
     <w:p>
       <w:pPr>
         <w:rPr>
@@ -122,15 +1027,7 @@
           <w:sz w:val="26"/>
           <w:szCs w:val="26"/>
         </w:rPr>
-        <w:t xml:space="preserve">Câu 1: </w:t>
-      </w:r>
-      <w:r>
-        <w:rPr>
-          <w:rFonts w:ascii="Times New Roman" w:hAnsi="Times New Roman" w:cs="Times New Roman"/>
-          <w:sz w:val="26"/>
-          <w:szCs w:val="26"/>
-        </w:rPr>
-        <w:t>Vì sao LAB 6 phải dùng topology riêng thay vì tiếp tục sử dụng trực tiếp topology LAB 5?</w:t>
+        <w:t>Câu 1: Vì sao LAB 6 phải dùng topology riêng thay vì tiếp tục sử dụng trực tiếp topology LAB 5?</w:t>
       </w:r>
     </w:p>
     <w:p>
@@ -1421,6 +2318,29 @@
     <w:name w:val="Normal"/>
     <w:qFormat/>
   </w:style>
+  <w:style w:type="paragraph" w:styleId="Heading2">
+    <w:name w:val="heading 2"/>
+    <w:basedOn w:val="Normal"/>
+    <w:next w:val="Normal"/>
+    <w:link w:val="Heading2Char"/>
+    <w:uiPriority w:val="9"/>
+    <w:semiHidden/>
+    <w:unhideWhenUsed/>
+    <w:qFormat/>
+    <w:rsid w:val="009F2C0F"/>
+    <w:pPr>
+      <w:keepNext/>
+      <w:keepLines/>
+      <w:spacing w:before="40" w:after="0"/>
+      <w:outlineLvl w:val="1"/>
+    </w:pPr>
+    <w:rPr>
+      <w:rFonts w:asciiTheme="majorHAnsi" w:eastAsiaTheme="majorEastAsia" w:hAnsiTheme="majorHAnsi" w:cstheme="majorBidi"/>
+      <w:color w:val="2E74B5" w:themeColor="accent1" w:themeShade="BF"/>
+      <w:sz w:val="26"/>
+      <w:szCs w:val="26"/>
+    </w:rPr>
+  </w:style>
   <w:style w:type="paragraph" w:styleId="Heading3">
     <w:name w:val="heading 3"/>
     <w:basedOn w:val="Normal"/>
@@ -1508,6 +2428,31 @@
       <w:rFonts w:ascii="Courier New" w:eastAsia="Times New Roman" w:hAnsi="Courier New" w:cs="Courier New"/>
       <w:sz w:val="20"/>
       <w:szCs w:val="20"/>
+    </w:rPr>
+  </w:style>
+  <w:style w:type="character" w:customStyle="1" w:styleId="Heading2Char">
+    <w:name w:val="Heading 2 Char"/>
+    <w:basedOn w:val="DefaultParagraphFont"/>
+    <w:link w:val="Heading2"/>
+    <w:uiPriority w:val="9"/>
+    <w:semiHidden/>
+    <w:rsid w:val="009F2C0F"/>
+    <w:rPr>
+      <w:rFonts w:asciiTheme="majorHAnsi" w:eastAsiaTheme="majorEastAsia" w:hAnsiTheme="majorHAnsi" w:cstheme="majorBidi"/>
+      <w:color w:val="2E74B5" w:themeColor="accent1" w:themeShade="BF"/>
+      <w:sz w:val="26"/>
+      <w:szCs w:val="26"/>
+    </w:rPr>
+  </w:style>
+  <w:style w:type="character" w:styleId="Hyperlink">
+    <w:name w:val="Hyperlink"/>
+    <w:basedOn w:val="DefaultParagraphFont"/>
+    <w:uiPriority w:val="99"/>
+    <w:unhideWhenUsed/>
+    <w:rsid w:val="00C32BBB"/>
+    <w:rPr>
+      <w:color w:val="0563C1" w:themeColor="hyperlink"/>
+      <w:u w:val="single"/>
     </w:rPr>
   </w:style>
 </w:styles>

</xml_diff>